<commit_message>
Child safety officer required only for Davidson, Maji Mazuri and Open Mind Africa: requires_safety_officer flag, approval check, dashboard card, policy and decision log
Co-Authored-By: Claude Sonnet 5.5 <noreply@anthropic.com>
</commit_message>
<xml_diff>
--- a/docs/child-protection/Child-Safeguarding-Policy.docx
+++ b/docs/child-protection/Child-Safeguarding-Policy.docx
@@ -58,7 +58,7 @@
     </w:p>
     <w:p>
       <w:r>
-        <w:t xml:space="preserve">Every organization we work with must name a </w:t>
+        <w:t xml:space="preserve">Davidson AI Futures Lab, Maji Mazuri and Open Mind Africa must each name a </w:t>
       </w:r>
       <w:r>
         <w:rPr>
@@ -67,7 +67,7 @@
         <w:t>child safety officer</w:t>
       </w:r>
       <w:r>
-        <w:t xml:space="preserve"> before any child is enrolled. The platform enforces this: registering an organization asks for one, learners cannot be approved without one, and the officer's name and contact details appear on the organization's leader dashboard, on each member's profile, and on the family "My path" card. At the Davidson AI Futures Lab it is Confidence Onuoha. In this policy "child-protection lead" and "child safety officer" mean the same person.</w:t>
+        <w:t xml:space="preserve"> before any child is enrolled, and so must any new organization that serves children (the platform administrator switches this on for it). The platform enforces this: learners cannot be approved without one, and the officer's name and contact details appear on the organization's leader dashboard, on each member's profile, and on the family "My path" card. Other organizations, such as universities and adult groups, need none. At the Davidson AI Futures Lab it is Confidence Onuoha. In this policy "child-protection lead" and "child safety officer" mean the same person.</w:t>
       </w:r>
     </w:p>
     <w:p>

</xml_diff>

<commit_message>
Child safety officer required only for Davidson, Maji Mazuri and Open Mind Africa: requires_safety_officer flag, approval check, dashboard card, policy and decision log (#333)
Co-authored-by: Claude Sonnet 5.5 <noreply@anthropic.com>
</commit_message>
<xml_diff>
--- a/docs/child-protection/Child-Safeguarding-Policy.docx
+++ b/docs/child-protection/Child-Safeguarding-Policy.docx
@@ -58,7 +58,7 @@
     </w:p>
     <w:p>
       <w:r>
-        <w:t xml:space="preserve">Every organization we work with must name a </w:t>
+        <w:t xml:space="preserve">Davidson AI Futures Lab, Maji Mazuri and Open Mind Africa must each name a </w:t>
       </w:r>
       <w:r>
         <w:rPr>
@@ -67,7 +67,7 @@
         <w:t>child safety officer</w:t>
       </w:r>
       <w:r>
-        <w:t xml:space="preserve"> before any child is enrolled. The platform enforces this: registering an organization asks for one, learners cannot be approved without one, and the officer's name and contact details appear on the organization's leader dashboard, on each member's profile, and on the family "My path" card. At the Davidson AI Futures Lab it is Confidence Onuoha. In this policy "child-protection lead" and "child safety officer" mean the same person.</w:t>
+        <w:t xml:space="preserve"> before any child is enrolled, and so must any new organization that serves children (the platform administrator switches this on for it). The platform enforces this: learners cannot be approved without one, and the officer's name and contact details appear on the organization's leader dashboard, on each member's profile, and on the family "My path" card. Other organizations, such as universities and adult groups, need none. At the Davidson AI Futures Lab it is Confidence Onuoha. In this policy "child-protection lead" and "child safety officer" mean the same person.</w:t>
       </w:r>
     </w:p>
     <w:p>

</xml_diff>